<commit_message>
edit mysite remove phone no
</commit_message>
<xml_diff>
--- a/mysite/AKINWUMI+SamuelResume.docx
+++ b/mysite/AKINWUMI+SamuelResume.docx
@@ -145,16 +145,25 @@
           <w:szCs w:val="20"/>
         </w:rPr>
       </w:pPr>
-      <w:r>
-        <w:rPr>
-          <w:rFonts w:ascii="Times New Roman" w:cs="Times New Roman" w:eastAsia="Times New Roman" w:hAnsi="Times New Roman"/>
-          <w:i w:val="1"/>
-          <w:iCs w:val="1"/>
-          <w:sz w:val="20"/>
-          <w:szCs w:val="20"/>
-          <w:rtl w:val="0"/>
-        </w:rPr>
-        <w:t xml:space="preserve"> +14379860974</w:t>
+      <w:hyperlink r:id="rId7">
+        <w:r>
+          <w:rPr>
+            <w:rFonts w:ascii="Times New Roman" w:cs="Times New Roman" w:eastAsia="Times New Roman" w:hAnsi="Times New Roman"/>
+            <w:i w:val="1"/>
+            <w:iCs w:val="1"/>
+            <w:color w:val="1155cc"/>
+            <w:sz w:val="20"/>
+            <w:szCs w:val="20"/>
+            <w:u w:val="single"/>
+            <w:rtl w:val="0"/>
+          </w:rPr>
+          <w:t xml:space="preserve"> akinwumisamuel.com</w:t>
+        </w:r>
+      </w:hyperlink>
+      <w:r>
+        <w:rPr>
+          <w:rtl w:val="0"/>
+        </w:rPr>
       </w:r>
     </w:p>
     <w:p>
@@ -176,6 +185,43 @@
         <w:jc w:val="left"/>
         <w:rPr>
           <w:rFonts w:ascii="Times New Roman" w:cs="Times New Roman" w:eastAsia="Times New Roman" w:hAnsi="Times New Roman"/>
+          <w:i w:val="1"/>
+          <w:iCs w:val="1"/>
+          <w:sz w:val="20"/>
+          <w:szCs w:val="20"/>
+        </w:rPr>
+      </w:pPr>
+      <w:r>
+        <w:rPr>
+          <w:rFonts w:ascii="Times New Roman" w:cs="Times New Roman" w:eastAsia="Times New Roman" w:hAnsi="Times New Roman"/>
+          <w:i w:val="1"/>
+          <w:iCs w:val="1"/>
+          <w:sz w:val="20"/>
+          <w:szCs w:val="20"/>
+          <w:rtl w:val="0"/>
+        </w:rPr>
+        <w:t xml:space="preserve"> +14379860974</w:t>
+      </w:r>
+    </w:p>
+    <w:p>
+      <w:pPr>
+        <w:keepNext w:val="0"/>
+        <w:keepLines w:val="0"/>
+        <w:pageBreakBefore w:val="0"/>
+        <w:widowControl w:val="0"/>
+        <w:pBdr>
+          <w:top w:space="0" w:sz="0" w:val="nil"/>
+          <w:left w:space="0" w:sz="0" w:val="nil"/>
+          <w:bottom w:space="0" w:sz="0" w:val="nil"/>
+          <w:right w:space="0" w:sz="0" w:val="nil"/>
+          <w:between w:space="0" w:sz="0" w:val="nil"/>
+        </w:pBdr>
+        <w:shd w:fill="auto" w:val="clear"/>
+        <w:spacing w:after="0" w:before="0" w:line="240" w:lineRule="auto"/>
+        <w:ind w:left="22.679901123046875" w:right="-630" w:hanging="22.679901123046875"/>
+        <w:jc w:val="left"/>
+        <w:rPr>
+          <w:rFonts w:ascii="Times New Roman" w:cs="Times New Roman" w:eastAsia="Times New Roman" w:hAnsi="Times New Roman"/>
           <w:b w:val="0"/>
           <w:bCs w:val="0"/>
           <w:i w:val="1"/>
@@ -796,9 +842,9 @@
           <w:szCs w:val="20"/>
           <w:rtl w:val="0"/>
         </w:rPr>
-        <w:t xml:space="preserve">Cloud Engineer                                                                                                                                              Sep2026-date </w:t>
+        <w:t xml:space="preserve">Cloud Engineer                                                                                                                                                       Sep2026-date </w:t>
         <w:br w:type="textWrapping"/>
-        <w:t xml:space="preserve">Solecurity</w:t>
+        <w:t xml:space="preserve">Solecurity (Freelancer)</w:t>
         <w:br w:type="textWrapping"/>
       </w:r>
       <w:r>
@@ -952,6 +998,31 @@
           <w:rtl w:val="0"/>
         </w:rPr>
         <w:t xml:space="preserve">Automated Linux-based EC2 administration using Bash and Python scripts, streamlining server provisioning, configuration management, and infrastructure maintenance.</w:t>
+      </w:r>
+    </w:p>
+    <w:p>
+      <w:pPr>
+        <w:keepLines w:val="1"/>
+        <w:numPr>
+          <w:ilvl w:val="0"/>
+          <w:numId w:val="1"/>
+        </w:numPr>
+        <w:ind w:left="720" w:right="-630"/>
+        <w:rPr>
+          <w:rFonts w:ascii="Times New Roman" w:cs="Times New Roman" w:eastAsia="Times New Roman" w:hAnsi="Times New Roman"/>
+          <w:sz w:val="20"/>
+          <w:szCs w:val="20"/>
+          <w:u w:val="none"/>
+        </w:rPr>
+      </w:pPr>
+      <w:r>
+        <w:rPr>
+          <w:rFonts w:ascii="Times New Roman" w:cs="Times New Roman" w:eastAsia="Times New Roman" w:hAnsi="Times New Roman"/>
+          <w:sz w:val="20"/>
+          <w:szCs w:val="20"/>
+          <w:rtl w:val="0"/>
+        </w:rPr>
+        <w:t xml:space="preserve">Implemented AI powered secure SDLC scanning with secret detection, IaC &amp; container scanning, triage and threat modeling</w:t>
       </w:r>
     </w:p>
     <w:p>
@@ -1012,10 +1083,9 @@
         <w:tab/>
         <w:tab/>
         <w:tab/>
-        <w:tab/>
-        <w:t xml:space="preserve"> May 2023-date </w:t>
+        <w:t xml:space="preserve">May 2023-date </w:t>
         <w:br w:type="textWrapping"/>
-        <w:t xml:space="preserve">Edelman Inc Canada </w:t>
+        <w:t xml:space="preserve">Edelman Inc Canada (Full time)</w:t>
       </w:r>
       <w:r>
         <w:rPr>
@@ -1755,7 +1825,7 @@
         </w:rPr>
         <w:t xml:space="preserve">Developed secure cryptocurrency solutions using Django, Symfony, and </w:t>
       </w:r>
-      <w:hyperlink r:id="rId7">
+      <w:hyperlink r:id="rId8">
         <w:r>
           <w:rPr>
             <w:rFonts w:ascii="Times New Roman" w:cs="Times New Roman" w:eastAsia="Times New Roman" w:hAnsi="Times New Roman"/>

</xml_diff>